<commit_message>
Netzwerk update after UCGF migration.
</commit_message>
<xml_diff>
--- a/_netzwerk/netzwerk_dokumentation_erweitert.docx
+++ b/_netzwerk/netzwerk_dokumentation_erweitert.docx
@@ -1,1220 +1,289 @@
 
 <file path=word/document.xml><?xml version="1.0" encoding="utf-8"?>
-<w:document xmlns:wpc="http://schemas.microsoft.com/office/word/2010/wordprocessingCanvas" xmlns:cx="http://schemas.microsoft.com/office/drawing/2014/chartex" xmlns:cx1="http://schemas.microsoft.com/office/drawing/2015/9/8/chartex" xmlns:cx2="http://schemas.microsoft.com/office/drawing/2015/10/21/chartex" xmlns:cx3="http://schemas.microsoft.com/office/drawing/2016/5/9/chartex" xmlns:cx4="http://schemas.microsoft.com/office/drawing/2016/5/10/chartex" xmlns:cx5="http://schemas.microsoft.com/office/drawing/2016/5/11/chartex" xmlns:cx6="http://schemas.microsoft.com/office/drawing/2016/5/12/chartex" xmlns:cx7="http://schemas.microsoft.com/office/drawing/2016/5/13/chartex" xmlns:cx8="http://schemas.microsoft.com/office/drawing/2016/5/14/chartex" xmlns:mc="http://schemas.openxmlformats.org/markup-compatibility/2006" xmlns:aink="http://schemas.microsoft.com/office/drawing/2016/ink" xmlns:am3d="http://schemas.microsoft.com/office/drawing/2017/model3d" xmlns:o="urn:schemas-microsoft-com:office:office" xmlns:oel="http://schemas.microsoft.com/office/2019/extlst" xmlns:r="http://schemas.openxmlformats.org/officeDocument/2006/relationships" xmlns:m="http://schemas.openxmlformats.org/officeDocument/2006/math" xmlns:v="urn:schemas-microsoft-com:vml" xmlns:wp14="http://schemas.microsoft.com/office/word/2010/wordprocessingDrawing" xmlns:wp="http://schemas.openxmlformats.org/drawingml/2006/wordprocessingDrawing" xmlns:w10="urn:schemas-microsoft-com:office:word" xmlns:w="http://schemas.openxmlformats.org/wordprocessingml/2006/main" xmlns:w14="http://schemas.microsoft.com/office/word/2010/wordml" xmlns:w15="http://schemas.microsoft.com/office/word/2012/wordml" xmlns:w16cex="http://schemas.microsoft.com/office/word/2018/wordml/cex" xmlns:w16cid="http://schemas.microsoft.com/office/word/2016/wordml/cid" xmlns:w16="http://schemas.microsoft.com/office/word/2018/wordml" xmlns:w16du="http://schemas.microsoft.com/office/word/2023/wordml/word16du" xmlns:w16sdtdh="http://schemas.microsoft.com/office/word/2020/wordml/sdtdatahash" xmlns:w16sdtfl="http://schemas.microsoft.com/office/word/2024/wordml/sdtformatlock" xmlns:w16se="http://schemas.microsoft.com/office/word/2015/wordml/symex" xmlns:wpg="http://schemas.microsoft.com/office/word/2010/wordprocessingGroup" xmlns:wpi="http://schemas.microsoft.com/office/word/2010/wordprocessingInk" xmlns:wne="http://schemas.microsoft.com/office/word/2006/wordml" xmlns:wps="http://schemas.microsoft.com/office/word/2010/wordprocessingShape" mc:Ignorable="w14 w15 w16se w16cid w16 w16cex w16sdtdh w16sdtfl w16du wp14">
+<w:document xmlns:ns1="http://schemas.openxmlformats.org/markup-compatibility/2006" xmlns:w="http://schemas.openxmlformats.org/wordprocessingml/2006/main" ns1:Ignorable="w14 w15 w16se w16cid w16 w16cex w16sdtdh w16sdtfl w16du wp14">
   <w:body>
     <w:p>
       <w:pPr>
-        <w:pStyle w:val="Titel"/>
-        <w:rPr>
-          <w:lang w:val="de-DE"/>
-        </w:rPr>
+        <w:pStyle w:val="berschrift1"/>
       </w:pPr>
       <w:r>
-        <w:rPr>
-          <w:lang w:val="de-DE"/>
-        </w:rPr>
-        <w:t>Netzwerkdokumentation – Ist &amp; Soll</w:t>
+        <w:t>Netzwerkdokumentation - Ist-Zustand nach UCGF-Migration</w:t>
+      </w:r>
+    </w:p>
+    <w:p>
+      <w:r>
+        <w:t>Stand: 2026-04-04</w:t>
       </w:r>
     </w:p>
     <w:p>
       <w:pPr>
         <w:pStyle w:val="berschrift1"/>
-        <w:rPr>
-          <w:lang w:val="de-DE"/>
-        </w:rPr>
       </w:pPr>
       <w:r>
-        <w:rPr>
-          <w:lang w:val="de-DE"/>
-        </w:rPr>
-        <w:t>1. Ist-Zustand (Kurzfassung)</w:t>
-      </w:r>
-    </w:p>
-    <w:p>
-      <w:pPr>
-        <w:rPr>
-          <w:lang w:val="de-DE"/>
-        </w:rPr>
-      </w:pPr>
-      <w:r>
-        <w:rPr>
-          <w:lang w:val="de-DE"/>
-        </w:rPr>
-        <w:t># Netzwerkdokumentation – Ist-Zustand</w:t>
-      </w:r>
-      <w:r>
-        <w:rPr>
-          <w:lang w:val="de-DE"/>
-        </w:rPr>
-        <w:br/>
-      </w:r>
-      <w:r>
-        <w:rPr>
-          <w:lang w:val="de-DE"/>
-        </w:rPr>
-        <w:br/>
-        <w:t>## 1. Übersicht</w:t>
-      </w:r>
-      <w:r>
-        <w:rPr>
-          <w:lang w:val="de-DE"/>
-        </w:rPr>
-        <w:br/>
-      </w:r>
-      <w:r>
-        <w:rPr>
-          <w:lang w:val="de-DE"/>
-        </w:rPr>
-        <w:br/>
-        <w:t>**</w:t>
-      </w:r>
-      <w:proofErr w:type="gramStart"/>
-      <w:r>
-        <w:rPr>
-          <w:lang w:val="de-DE"/>
-        </w:rPr>
-        <w:t>Netzwerkname:*</w:t>
-      </w:r>
-      <w:proofErr w:type="gramEnd"/>
-      <w:r>
-        <w:rPr>
-          <w:lang w:val="de-DE"/>
-        </w:rPr>
-        <w:t xml:space="preserve">* Heimnetz  </w:t>
-      </w:r>
-      <w:r>
-        <w:rPr>
-          <w:lang w:val="de-DE"/>
-        </w:rPr>
-        <w:br/>
-        <w:t>**</w:t>
-      </w:r>
-      <w:proofErr w:type="gramStart"/>
-      <w:r>
-        <w:rPr>
-          <w:lang w:val="de-DE"/>
-        </w:rPr>
-        <w:t>Subnetz:*</w:t>
-      </w:r>
-      <w:proofErr w:type="gramEnd"/>
-      <w:r>
-        <w:rPr>
-          <w:lang w:val="de-DE"/>
-        </w:rPr>
-        <w:t xml:space="preserve">* 192.168.178.0/24  </w:t>
+        <w:t>1. Kontext</w:t>
       </w:r>
     </w:p>
     <w:p>
       <w:r>
-        <w:t>*</w:t>
-      </w:r>
-      <w:r>
-        <w:t xml:space="preserve">*Internal </w:t>
-      </w:r>
-      <w:proofErr w:type="gramStart"/>
-      <w:r>
-        <w:t>Domain:*</w:t>
-      </w:r>
-      <w:proofErr w:type="gramEnd"/>
-      <w:r>
-        <w:t>* home.leimnitz.de</w:t>
-      </w:r>
-      <w:r>
-        <w:br/>
-      </w:r>
-      <w:r>
-        <w:br/>
-        <w:t>**</w:t>
-      </w:r>
-      <w:proofErr w:type="gramStart"/>
-      <w:r>
-        <w:t>Gateway:*</w:t>
-      </w:r>
-      <w:proofErr w:type="gramEnd"/>
-      <w:r>
-        <w:t xml:space="preserve">*  </w:t>
-      </w:r>
-      <w:r>
-        <w:br/>
-        <w:t xml:space="preserve">- </w:t>
-      </w:r>
-      <w:proofErr w:type="spellStart"/>
-      <w:proofErr w:type="gramStart"/>
-      <w:r>
-        <w:t>FRITZ!Box</w:t>
-      </w:r>
-      <w:proofErr w:type="spellEnd"/>
-      <w:proofErr w:type="gramEnd"/>
-      <w:r>
-        <w:t xml:space="preserve"> 7590 AX – 192.168.178.1  </w:t>
-      </w:r>
-      <w:r>
-        <w:br/>
-      </w:r>
-      <w:r>
-        <w:br/>
-        <w:t>**</w:t>
-      </w:r>
-      <w:proofErr w:type="gramStart"/>
-      <w:r>
-        <w:t>DHCP:*</w:t>
-      </w:r>
-      <w:proofErr w:type="gramEnd"/>
-      <w:r>
-        <w:t xml:space="preserve">*  </w:t>
-      </w:r>
-      <w:r>
-        <w:br/>
-        <w:t xml:space="preserve">- </w:t>
-      </w:r>
-      <w:proofErr w:type="spellStart"/>
-      <w:r>
-        <w:t>Bereich</w:t>
-      </w:r>
-      <w:proofErr w:type="spellEnd"/>
-      <w:r>
-        <w:t xml:space="preserve">: 192.168.178.90 – 192.168.178.199  </w:t>
-      </w:r>
-      <w:r>
-        <w:br/>
-      </w:r>
-      <w:r>
-        <w:br/>
-        <w:t>**</w:t>
-      </w:r>
-      <w:proofErr w:type="gramStart"/>
-      <w:r>
-        <w:t>DNS:*</w:t>
-      </w:r>
-      <w:proofErr w:type="gramEnd"/>
-      <w:r>
-        <w:t xml:space="preserve">*  </w:t>
-      </w:r>
-      <w:r>
-        <w:br/>
-        <w:t>- 192.168.178.10 (</w:t>
-      </w:r>
-      <w:proofErr w:type="gramStart"/>
-      <w:r>
-        <w:t xml:space="preserve">NAS)  </w:t>
-      </w:r>
-      <w:proofErr w:type="spellStart"/>
-      <w:r>
-        <w:t>Adguard</w:t>
-      </w:r>
-      <w:proofErr w:type="spellEnd"/>
-      <w:proofErr w:type="gramEnd"/>
-    </w:p>
-    <w:p>
-      <w:r>
-        <w:t xml:space="preserve">- 192.168.178.12 (Home Assistant) </w:t>
-      </w:r>
-      <w:proofErr w:type="spellStart"/>
-      <w:r>
-        <w:t>Adguard</w:t>
-      </w:r>
-      <w:proofErr w:type="spellEnd"/>
-      <w:r>
-        <w:br/>
+        <w:t>- Produktiv-LAN weiterhin 192.168.178.0/24.</w:t>
       </w:r>
     </w:p>
     <w:p>
       <w:r>
-        <w:t xml:space="preserve">**Reverse </w:t>
-      </w:r>
-      <w:proofErr w:type="gramStart"/>
-      <w:r>
-        <w:t>Proxy:*</w:t>
-      </w:r>
-      <w:proofErr w:type="gramEnd"/>
-      <w:r>
-        <w:t>*</w:t>
+        <w:t>- Die UniFi Cloud Gateway Fiber (UCGF) uebernimmt Routing, DHCP und zentrale Netzwerksteuerung.</w:t>
       </w:r>
     </w:p>
     <w:p>
       <w:r>
-        <w:t>- 192.168.178.10:81 (QNAP/NGINX)</w:t>
+        <w:t>- Die FRITZ!Box 7590 AX bleibt als Upstream-Gateway / NAT im Vornetz 192.168.180.0/24.</w:t>
       </w:r>
     </w:p>
     <w:p>
-      <w:pPr>
-        <w:rPr>
-          <w:lang w:val="de-DE"/>
-        </w:rPr>
-      </w:pPr>
       <w:r>
-        <w:rPr>
-          <w:lang w:val="de-DE"/>
-        </w:rPr>
-        <w:br/>
-        <w:t>---</w:t>
-      </w:r>
-      <w:r>
-        <w:rPr>
-          <w:lang w:val="de-DE"/>
-        </w:rPr>
-        <w:br/>
-      </w:r>
-      <w:r>
-        <w:rPr>
-          <w:lang w:val="de-DE"/>
-        </w:rPr>
-        <w:br/>
-        <w:t>## 2. Topologie</w:t>
-      </w:r>
-      <w:r>
-        <w:rPr>
-          <w:lang w:val="de-DE"/>
-        </w:rPr>
-        <w:br/>
-      </w:r>
-      <w:r>
-        <w:rPr>
-          <w:lang w:val="de-DE"/>
-        </w:rPr>
-        <w:br/>
-        <w:t>```</w:t>
-      </w:r>
-      <w:r>
-        <w:rPr>
-          <w:lang w:val="de-DE"/>
-        </w:rPr>
-        <w:br/>
-        <w:t xml:space="preserve">Internet → </w:t>
-      </w:r>
-      <w:proofErr w:type="spellStart"/>
-      <w:proofErr w:type="gramStart"/>
-      <w:r>
-        <w:rPr>
-          <w:lang w:val="de-DE"/>
-        </w:rPr>
-        <w:t>FRITZ!Box</w:t>
-      </w:r>
-      <w:proofErr w:type="spellEnd"/>
-      <w:proofErr w:type="gramEnd"/>
-      <w:r>
-        <w:rPr>
-          <w:lang w:val="de-DE"/>
-        </w:rPr>
-        <w:t xml:space="preserve"> → </w:t>
-      </w:r>
-      <w:r>
-        <w:rPr>
-          <w:lang w:val="de-DE"/>
-        </w:rPr>
-        <w:t>SX105</w:t>
-      </w:r>
-      <w:r>
-        <w:rPr>
-          <w:lang w:val="de-DE"/>
-        </w:rPr>
-        <w:t xml:space="preserve">→ </w:t>
-      </w:r>
-      <w:r>
-        <w:rPr>
-          <w:lang w:val="de-DE"/>
-        </w:rPr>
-        <w:t>SX1008 (Core Switch)</w:t>
-      </w:r>
-      <w:r>
-        <w:rPr>
-          <w:lang w:val="de-DE"/>
-        </w:rPr>
-        <w:br/>
-      </w:r>
-      <w:r>
-        <w:rPr>
-          <w:lang w:val="de-DE"/>
-        </w:rPr>
-        <w:br/>
-      </w:r>
-      <w:r>
-        <w:rPr>
-          <w:lang w:val="de-DE"/>
-        </w:rPr>
-        <w:t>Direkt</w:t>
-      </w:r>
-      <w:r>
-        <w:rPr>
-          <w:lang w:val="de-DE"/>
-        </w:rPr>
-        <w:t xml:space="preserve"> an der </w:t>
-      </w:r>
-      <w:proofErr w:type="spellStart"/>
-      <w:r>
-        <w:rPr>
-          <w:lang w:val="de-DE"/>
-        </w:rPr>
-        <w:t>Fritzbox</w:t>
-      </w:r>
-      <w:proofErr w:type="spellEnd"/>
-      <w:r>
-        <w:rPr>
-          <w:lang w:val="de-DE"/>
-        </w:rPr>
-        <w:t>:</w:t>
-      </w:r>
-    </w:p>
-    <w:p>
-      <w:pPr>
-        <w:pStyle w:val="Listenabsatz"/>
-        <w:numPr>
-          <w:ilvl w:val="0"/>
-          <w:numId w:val="12"/>
-        </w:numPr>
-      </w:pPr>
-      <w:r>
-        <w:t>Home Assistant (2 I</w:t>
-      </w:r>
-      <w:r>
-        <w:t>Ps</w:t>
-      </w:r>
-      <w:r>
-        <w:t>)</w:t>
-      </w:r>
-    </w:p>
-    <w:p>
-      <w:proofErr w:type="spellStart"/>
-      <w:r>
-        <w:t>Vom</w:t>
-      </w:r>
-      <w:proofErr w:type="spellEnd"/>
-      <w:r>
-        <w:t xml:space="preserve"> SX105:</w:t>
-      </w:r>
-    </w:p>
-    <w:p>
-      <w:pPr>
-        <w:pStyle w:val="Listenabsatz"/>
-        <w:numPr>
-          <w:ilvl w:val="0"/>
-          <w:numId w:val="11"/>
-        </w:numPr>
-        <w:rPr>
-          <w:lang w:val="de-DE"/>
-        </w:rPr>
-      </w:pPr>
-      <w:proofErr w:type="spellStart"/>
-      <w:r>
-        <w:t>Unterverteilung</w:t>
-      </w:r>
-      <w:proofErr w:type="spellEnd"/>
-      <w:r>
-        <w:t xml:space="preserve"> ins LAN</w:t>
-      </w:r>
-    </w:p>
-    <w:p>
-      <w:pPr>
-        <w:pStyle w:val="Listenabsatz"/>
-        <w:numPr>
-          <w:ilvl w:val="0"/>
-          <w:numId w:val="11"/>
-        </w:numPr>
-        <w:rPr>
-          <w:lang w:val="de-DE"/>
-        </w:rPr>
-      </w:pPr>
-      <w:r>
-        <w:t xml:space="preserve">3 </w:t>
-      </w:r>
-      <w:proofErr w:type="spellStart"/>
-      <w:r>
-        <w:t>Leitungen</w:t>
-      </w:r>
-      <w:proofErr w:type="spellEnd"/>
-      <w:r>
-        <w:t xml:space="preserve">: </w:t>
-      </w:r>
-      <w:proofErr w:type="spellStart"/>
-      <w:r>
-        <w:t>Wohnzimmer</w:t>
-      </w:r>
-      <w:proofErr w:type="spellEnd"/>
-      <w:r>
-        <w:t xml:space="preserve">, </w:t>
-      </w:r>
-      <w:proofErr w:type="spellStart"/>
-      <w:r>
-        <w:t>Schlafzimmer</w:t>
-      </w:r>
-      <w:proofErr w:type="spellEnd"/>
-      <w:r>
-        <w:t>, G</w:t>
-      </w:r>
-      <w:r>
-        <w:rPr>
-          <w:lang w:val="de-DE"/>
-        </w:rPr>
-        <w:t>ä</w:t>
-      </w:r>
-      <w:proofErr w:type="spellStart"/>
-      <w:r>
-        <w:t>stezimmer</w:t>
-      </w:r>
-      <w:proofErr w:type="spellEnd"/>
-    </w:p>
-    <w:p>
-      <w:pPr>
-        <w:pStyle w:val="Listenabsatz"/>
-        <w:numPr>
-          <w:ilvl w:val="0"/>
-          <w:numId w:val="11"/>
-        </w:numPr>
-        <w:rPr>
-          <w:lang w:val="de-DE"/>
-        </w:rPr>
-      </w:pPr>
-      <w:r>
-        <w:rPr>
-          <w:lang w:val="de-DE"/>
-        </w:rPr>
-        <w:lastRenderedPageBreak/>
-        <w:t xml:space="preserve">- </w:t>
-      </w:r>
-      <w:proofErr w:type="spellStart"/>
-      <w:r>
-        <w:rPr>
-          <w:lang w:val="de-DE"/>
-        </w:rPr>
-        <w:t>UniFi</w:t>
-      </w:r>
-      <w:proofErr w:type="spellEnd"/>
-      <w:r>
-        <w:rPr>
-          <w:lang w:val="de-DE"/>
-        </w:rPr>
-        <w:t xml:space="preserve"> </w:t>
-      </w:r>
-      <w:r>
-        <w:rPr>
-          <w:lang w:val="de-DE"/>
-        </w:rPr>
-        <w:t>Aps in die R</w:t>
-      </w:r>
-      <w:r>
-        <w:rPr>
-          <w:lang w:val="de-DE"/>
-        </w:rPr>
-        <w:t>äume</w:t>
-      </w:r>
-      <w:r>
-        <w:rPr>
-          <w:lang w:val="de-DE"/>
-        </w:rPr>
-        <w:t xml:space="preserve"> (U7-Pro Schlafzimmer direkt am SX105)</w:t>
-      </w:r>
-      <w:r>
-        <w:rPr>
-          <w:lang w:val="de-DE"/>
-        </w:rPr>
-        <w:br/>
-      </w:r>
-    </w:p>
-    <w:p>
-      <w:pPr>
-        <w:rPr>
-          <w:lang w:val="de-DE"/>
-        </w:rPr>
-      </w:pPr>
-      <w:proofErr w:type="spellStart"/>
-      <w:r>
-        <w:t>Vom</w:t>
-      </w:r>
-      <w:proofErr w:type="spellEnd"/>
-      <w:r>
-        <w:t xml:space="preserve"> Core Switch:</w:t>
-      </w:r>
-      <w:r>
-        <w:br/>
-        <w:t>- NAS (DNS)</w:t>
-      </w:r>
-      <w:r>
-        <w:br/>
-        <w:t>- UniFi Controller (</w:t>
-      </w:r>
-      <w:r>
-        <w:t>QNAP VM/Ubuntu</w:t>
-      </w:r>
-      <w:r>
-        <w:t>)</w:t>
-      </w:r>
-      <w:r>
-        <w:br/>
-        <w:t>- Clients</w:t>
-      </w:r>
-      <w:r>
-        <w:br/>
-      </w:r>
-      <w:r>
-        <w:br/>
-      </w:r>
-      <w:proofErr w:type="spellStart"/>
-      <w:r>
-        <w:t>Separat</w:t>
-      </w:r>
-      <w:proofErr w:type="spellEnd"/>
-      <w:r>
-        <w:t>:</w:t>
-      </w:r>
-      <w:r>
-        <w:br/>
-        <w:t xml:space="preserve">Powerline → Keller → </w:t>
-      </w:r>
-      <w:proofErr w:type="spellStart"/>
-      <w:r>
-        <w:t>Waschmaschine</w:t>
-      </w:r>
-      <w:proofErr w:type="spellEnd"/>
-      <w:r>
-        <w:br/>
-        <w:t>```</w:t>
-      </w:r>
-      <w:r>
-        <w:br/>
-      </w:r>
-      <w:r>
-        <w:br/>
-        <w:t>---</w:t>
-      </w:r>
-      <w:r>
-        <w:br/>
-      </w:r>
-      <w:r>
-        <w:br/>
-        <w:t xml:space="preserve">## 3. </w:t>
-      </w:r>
-      <w:proofErr w:type="spellStart"/>
-      <w:r>
-        <w:t>Infrastruktur</w:t>
-      </w:r>
-      <w:proofErr w:type="spellEnd"/>
-      <w:r>
-        <w:br/>
-      </w:r>
-      <w:r>
-        <w:br/>
-        <w:t xml:space="preserve">| </w:t>
-      </w:r>
-      <w:proofErr w:type="spellStart"/>
-      <w:r>
-        <w:t>Komponente</w:t>
-      </w:r>
-      <w:proofErr w:type="spellEnd"/>
-      <w:r>
-        <w:t xml:space="preserve">          | IP-</w:t>
-      </w:r>
-      <w:proofErr w:type="spellStart"/>
-      <w:r>
-        <w:t>Adresse</w:t>
-      </w:r>
-      <w:proofErr w:type="spellEnd"/>
-      <w:r>
-        <w:t xml:space="preserve">        | Rolle                |</w:t>
-      </w:r>
-      <w:r>
-        <w:br/>
-        <w:t>|--------------------|------------------|----------------------|</w:t>
-      </w:r>
-      <w:r>
-        <w:br/>
-        <w:t xml:space="preserve">| </w:t>
-      </w:r>
-      <w:proofErr w:type="spellStart"/>
-      <w:r>
-        <w:t>FRITZ!Box</w:t>
-      </w:r>
-      <w:proofErr w:type="spellEnd"/>
-      <w:r>
-        <w:t xml:space="preserve">          | 192.168.178.1    | Gateway / DHCP       |</w:t>
-      </w:r>
-      <w:r>
-        <w:br/>
-        <w:t>| NAS (QNAP)         | 192.168.178.10   | DNS / Storage        |</w:t>
-      </w:r>
-      <w:r>
-        <w:br/>
-        <w:t>| Home Assistant     | .11 / .12        | Automation           |</w:t>
-      </w:r>
-      <w:r>
-        <w:br/>
-        <w:t>| UniFi Controller   | 192.168.178.14   | WLAN Management      |</w:t>
-      </w:r>
-      <w:r>
-        <w:br/>
-        <w:t xml:space="preserve">| U7-Pro Router      | 192.168.178.8    | WLAN </w:t>
-      </w:r>
-      <w:proofErr w:type="spellStart"/>
-      <w:r>
-        <w:t>Infrastruktur</w:t>
-      </w:r>
-      <w:proofErr w:type="spellEnd"/>
-      <w:r>
-        <w:t xml:space="preserve">   |</w:t>
-      </w:r>
-      <w:r>
-        <w:br/>
-        <w:t>| Access Points      | .4 / .8 / .9     | WLAN                 |</w:t>
-      </w:r>
-      <w:r>
-        <w:br/>
-      </w:r>
-      <w:r>
-        <w:br/>
-        <w:t>---</w:t>
-      </w:r>
-      <w:r>
-        <w:br/>
-      </w:r>
-      <w:r>
-        <w:br/>
-        <w:t xml:space="preserve">## 4. </w:t>
-      </w:r>
-      <w:r>
-        <w:rPr>
-          <w:lang w:val="de-DE"/>
-        </w:rPr>
-        <w:t>WLAN</w:t>
-      </w:r>
-      <w:r>
-        <w:rPr>
-          <w:lang w:val="de-DE"/>
-        </w:rPr>
-        <w:br/>
-      </w:r>
-      <w:r>
-        <w:rPr>
-          <w:lang w:val="de-DE"/>
-        </w:rPr>
-        <w:br/>
-        <w:t xml:space="preserve">### </w:t>
-      </w:r>
-      <w:proofErr w:type="spellStart"/>
-      <w:r>
-        <w:rPr>
-          <w:lang w:val="de-DE"/>
-        </w:rPr>
-        <w:t>Smallnet</w:t>
-      </w:r>
-      <w:proofErr w:type="spellEnd"/>
-      <w:r>
-        <w:rPr>
-          <w:lang w:val="de-DE"/>
-        </w:rPr>
-        <w:br/>
-        <w:t>- 5 GHz / 6 GHz</w:t>
-      </w:r>
-      <w:r>
-        <w:rPr>
-          <w:lang w:val="de-DE"/>
-        </w:rPr>
-        <w:br/>
-        <w:t>- WPA3</w:t>
-      </w:r>
-      <w:r>
-        <w:rPr>
-          <w:lang w:val="de-DE"/>
-        </w:rPr>
-        <w:br/>
-      </w:r>
-      <w:r>
-        <w:rPr>
-          <w:lang w:val="de-DE"/>
-        </w:rPr>
-        <w:br/>
-        <w:t>### smallnet-5g</w:t>
-      </w:r>
-      <w:r>
-        <w:rPr>
-          <w:lang w:val="de-DE"/>
-        </w:rPr>
-        <w:br/>
-        <w:t>- 5 GHz</w:t>
-      </w:r>
-      <w:r>
-        <w:rPr>
-          <w:lang w:val="de-DE"/>
-        </w:rPr>
-        <w:br/>
-        <w:t>- WPA2/WPA3</w:t>
-      </w:r>
-      <w:r>
-        <w:rPr>
-          <w:lang w:val="de-DE"/>
-        </w:rPr>
-        <w:br/>
-      </w:r>
-      <w:r>
-        <w:rPr>
-          <w:lang w:val="de-DE"/>
-        </w:rPr>
-        <w:br/>
-        <w:t xml:space="preserve">### </w:t>
-      </w:r>
-      <w:proofErr w:type="spellStart"/>
-      <w:r>
-        <w:rPr>
-          <w:lang w:val="de-DE"/>
-        </w:rPr>
-        <w:t>smallnet-iot</w:t>
-      </w:r>
-      <w:proofErr w:type="spellEnd"/>
-      <w:r>
-        <w:rPr>
-          <w:lang w:val="de-DE"/>
-        </w:rPr>
-        <w:br/>
-        <w:t>- 2.4 GHz</w:t>
-      </w:r>
-      <w:r>
-        <w:rPr>
-          <w:lang w:val="de-DE"/>
-        </w:rPr>
-        <w:br/>
-        <w:t>- WPA2</w:t>
-      </w:r>
-      <w:r>
-        <w:rPr>
-          <w:lang w:val="de-DE"/>
-        </w:rPr>
-        <w:br/>
-        <w:t>- eingeschränkt auf ausgewählte APs</w:t>
-      </w:r>
-      <w:r>
-        <w:rPr>
-          <w:lang w:val="de-DE"/>
-        </w:rPr>
-        <w:br/>
-      </w:r>
-      <w:r>
-        <w:rPr>
-          <w:lang w:val="de-DE"/>
-        </w:rPr>
-        <w:br/>
-        <w:t>---</w:t>
-      </w:r>
-      <w:r>
-        <w:rPr>
-          <w:lang w:val="de-DE"/>
-        </w:rPr>
-        <w:br/>
-      </w:r>
-      <w:r>
-        <w:rPr>
-          <w:lang w:val="de-DE"/>
-        </w:rPr>
-        <w:br/>
-      </w:r>
-      <w:r>
-        <w:rPr>
-          <w:lang w:val="de-DE"/>
-        </w:rPr>
-        <w:lastRenderedPageBreak/>
-        <w:t>## 5. Architektur</w:t>
-      </w:r>
-      <w:r>
-        <w:rPr>
-          <w:lang w:val="de-DE"/>
-        </w:rPr>
-        <w:br/>
-      </w:r>
-      <w:r>
-        <w:rPr>
-          <w:lang w:val="de-DE"/>
-        </w:rPr>
-        <w:br/>
-        <w:t xml:space="preserve">- Routing: </w:t>
-      </w:r>
-      <w:proofErr w:type="spellStart"/>
-      <w:r>
-        <w:rPr>
-          <w:lang w:val="de-DE"/>
-        </w:rPr>
-        <w:t>FRITZ!Box</w:t>
-      </w:r>
-      <w:proofErr w:type="spellEnd"/>
-      <w:r>
-        <w:rPr>
-          <w:lang w:val="de-DE"/>
-        </w:rPr>
-        <w:t xml:space="preserve">  </w:t>
-      </w:r>
-      <w:r>
-        <w:rPr>
-          <w:lang w:val="de-DE"/>
-        </w:rPr>
-        <w:br/>
-        <w:t xml:space="preserve">- DHCP: </w:t>
-      </w:r>
-      <w:proofErr w:type="spellStart"/>
-      <w:r>
-        <w:rPr>
-          <w:lang w:val="de-DE"/>
-        </w:rPr>
-        <w:t>FRITZ!Box</w:t>
-      </w:r>
-      <w:proofErr w:type="spellEnd"/>
-      <w:r>
-        <w:rPr>
-          <w:lang w:val="de-DE"/>
-        </w:rPr>
-        <w:t xml:space="preserve">  </w:t>
-      </w:r>
-      <w:r>
-        <w:rPr>
-          <w:lang w:val="de-DE"/>
-        </w:rPr>
-        <w:br/>
-        <w:t xml:space="preserve">- </w:t>
-      </w:r>
-      <w:proofErr w:type="spellStart"/>
-      <w:r>
-        <w:rPr>
-          <w:lang w:val="de-DE"/>
-        </w:rPr>
-        <w:t>UniFi</w:t>
-      </w:r>
-      <w:proofErr w:type="spellEnd"/>
-      <w:r>
-        <w:rPr>
-          <w:lang w:val="de-DE"/>
-        </w:rPr>
-        <w:t xml:space="preserve">: Layer-2 Infrastruktur (Bridge Mode)  </w:t>
-      </w:r>
-      <w:r>
-        <w:rPr>
-          <w:lang w:val="de-DE"/>
-        </w:rPr>
-        <w:br/>
-      </w:r>
-      <w:r>
-        <w:rPr>
-          <w:lang w:val="de-DE"/>
-        </w:rPr>
-        <w:br/>
-        <w:t>**Powerline:**</w:t>
-      </w:r>
-      <w:r>
-        <w:rPr>
-          <w:lang w:val="de-DE"/>
-        </w:rPr>
-        <w:br/>
-        <w:t>- isolierter Einsatz (Waschmaschine im Keller)</w:t>
-      </w:r>
-      <w:r>
-        <w:rPr>
-          <w:lang w:val="de-DE"/>
-        </w:rPr>
-        <w:br/>
-      </w:r>
-      <w:r>
-        <w:rPr>
-          <w:lang w:val="de-DE"/>
-        </w:rPr>
-        <w:br/>
-        <w:t>---</w:t>
-      </w:r>
-      <w:r>
-        <w:rPr>
-          <w:lang w:val="de-DE"/>
-        </w:rPr>
-        <w:br/>
-      </w:r>
-      <w:r>
-        <w:rPr>
-          <w:lang w:val="de-DE"/>
-        </w:rPr>
-        <w:br/>
-        <w:t>## 6. Bewertung</w:t>
-      </w:r>
-      <w:r>
-        <w:rPr>
-          <w:lang w:val="de-DE"/>
-        </w:rPr>
-        <w:br/>
-      </w:r>
-      <w:r>
-        <w:rPr>
-          <w:lang w:val="de-DE"/>
-        </w:rPr>
-        <w:br/>
-        <w:t xml:space="preserve">- klare Layer-3 Struktur  </w:t>
-      </w:r>
-      <w:r>
-        <w:rPr>
-          <w:lang w:val="de-DE"/>
-        </w:rPr>
-        <w:br/>
-        <w:t xml:space="preserve">- saubere IP-Planung  </w:t>
-      </w:r>
-      <w:r>
-        <w:rPr>
-          <w:lang w:val="de-DE"/>
-        </w:rPr>
-        <w:br/>
-        <w:t xml:space="preserve">- getrennte WLAN-Profile  </w:t>
-      </w:r>
-      <w:r>
-        <w:rPr>
-          <w:lang w:val="de-DE"/>
-        </w:rPr>
-        <w:br/>
-        <w:t xml:space="preserve">- kein Double NAT  </w:t>
-      </w:r>
-      <w:r>
-        <w:rPr>
-          <w:lang w:val="de-DE"/>
-        </w:rPr>
-        <w:br/>
-      </w:r>
-      <w:r>
-        <w:rPr>
-          <w:lang w:val="de-DE"/>
-        </w:rPr>
-        <w:br/>
-        <w:t>→ Architektur ist konsistent und wartbar</w:t>
-      </w:r>
-      <w:r>
-        <w:rPr>
-          <w:lang w:val="de-DE"/>
-        </w:rPr>
-        <w:br/>
+        <w:t>- QNAP bleibt zentraler DNS- und Service-Host fuer das interne Netz.</w:t>
       </w:r>
     </w:p>
     <w:p>
       <w:pPr>
         <w:pStyle w:val="berschrift1"/>
-        <w:rPr>
-          <w:lang w:val="de-DE"/>
-        </w:rPr>
       </w:pPr>
       <w:r>
-        <w:rPr>
-          <w:lang w:val="de-DE"/>
-        </w:rPr>
-        <w:t>2. Änderungslog</w:t>
+        <w:t>2. Logische Topologie</w:t>
       </w:r>
     </w:p>
     <w:p>
-      <w:pPr>
-        <w:rPr>
-          <w:lang w:val="de-DE"/>
-        </w:rPr>
-      </w:pPr>
       <w:r>
-        <w:rPr>
-          <w:lang w:val="de-DE"/>
-        </w:rPr>
-        <w:t>v1.0 – Ist-Zustand vor Migration (</w:t>
-      </w:r>
-      <w:proofErr w:type="spellStart"/>
-      <w:proofErr w:type="gramStart"/>
-      <w:r>
-        <w:rPr>
-          <w:lang w:val="de-DE"/>
-        </w:rPr>
-        <w:t>FRITZ!Box</w:t>
-      </w:r>
-      <w:proofErr w:type="spellEnd"/>
-      <w:proofErr w:type="gramEnd"/>
-      <w:r>
-        <w:rPr>
-          <w:lang w:val="de-DE"/>
-        </w:rPr>
-        <w:t xml:space="preserve"> 7590 AX)</w:t>
-      </w:r>
-      <w:r>
-        <w:rPr>
-          <w:lang w:val="de-DE"/>
-        </w:rPr>
-        <w:br/>
-        <w:t>v1.1 – Dokumentation konsolidiert</w:t>
-      </w:r>
-      <w:r>
-        <w:rPr>
-          <w:lang w:val="de-DE"/>
-        </w:rPr>
-        <w:br/>
+        <w:t>Internet -&gt; FRITZ!Box 7590 AX (192.168.180.1) -&gt; UCGF WAN -&gt; UCGF LAN / Gateway 192.168.178.1 -&gt; TL-SX105 -&gt; TL-SX1008 -&gt; Infrastruktur, Clients und Powerline.</w:t>
       </w:r>
     </w:p>
     <w:p>
       <w:pPr>
         <w:pStyle w:val="berschrift1"/>
-        <w:rPr>
-          <w:lang w:val="de-DE"/>
-        </w:rPr>
       </w:pPr>
       <w:r>
-        <w:rPr>
-          <w:lang w:val="de-DE"/>
-        </w:rPr>
-        <w:t>3. Soll-Zustand (nach Migration)</w:t>
+        <w:t>3. Kernkomponenten und Adressierung</w:t>
+      </w:r>
+    </w:p>
+    <w:p>
+      <w:r>
+        <w:t>- UCGF: 192.168.178.1 - Router / DHCP / zentrales Gateway</w:t>
+      </w:r>
+    </w:p>
+    <w:p>
+      <w:r>
+        <w:t>- FRITZ!Box 7590 AX: 192.168.180.1 - Upstream-Gateway / NAT / Exposed-Host-Ziel fuer UCGF</w:t>
+      </w:r>
+    </w:p>
+    <w:p>
+      <w:r>
+        <w:t>- QNAP NAS: 192.168.178.10 - AdGuard DNS / Docker / Reverse Proxy :81</w:t>
+      </w:r>
+    </w:p>
+    <w:p>
+      <w:r>
+        <w:t>- Home Assistant: 192.168.178.11 / .12 - Automation</w:t>
+      </w:r>
+    </w:p>
+    <w:p>
+      <w:r>
+        <w:t>- UniFi Controller: 192.168.178.14 - QNAP-VM / Ubuntu / WLAN-Verwaltung</w:t>
+      </w:r>
+    </w:p>
+    <w:p>
+      <w:r>
+        <w:t>- UniFi APs: 192.168.178.4 / .8 / .9 - WLAN-Infrastruktur</w:t>
+      </w:r>
+    </w:p>
+    <w:p>
+      <w:r>
+        <w:t>- DHCP-Clients: 192.168.178.100 bis 192.168.178.200</w:t>
       </w:r>
     </w:p>
     <w:p>
       <w:pPr>
-        <w:rPr>
-          <w:lang w:val="de-DE"/>
-        </w:rPr>
+        <w:pStyle w:val="berschrift1"/>
       </w:pPr>
       <w:r>
-        <w:rPr>
-          <w:lang w:val="de-DE"/>
-        </w:rPr>
-        <w:br/>
-        <w:t>Neue Komponente:</w:t>
+        <w:t>4. Physische Verkabelung</w:t>
       </w:r>
+    </w:p>
+    <w:p>
+      <w:pPr>
+        <w:pStyle w:val="berschrift2"/>
+      </w:pPr>
       <w:r>
-        <w:rPr>
-          <w:lang w:val="de-DE"/>
-        </w:rPr>
-        <w:br/>
-        <w:t xml:space="preserve">- </w:t>
+        <w:t>Abstellraum</w:t>
       </w:r>
-      <w:proofErr w:type="spellStart"/>
-      <w:proofErr w:type="gramStart"/>
+    </w:p>
+    <w:p>
       <w:r>
-        <w:rPr>
-          <w:lang w:val="de-DE"/>
-        </w:rPr>
-        <w:t>FRITZ!Box</w:t>
+        <w:t>- DSL-Anschluss -&gt; FRITZ!Box 7590 AX -&gt; UCGF -&gt; TP-Link TL-SX105</w:t>
       </w:r>
-      <w:proofErr w:type="spellEnd"/>
-      <w:proofErr w:type="gramEnd"/>
+    </w:p>
+    <w:p>
       <w:r>
-        <w:rPr>
-          <w:lang w:val="de-DE"/>
-        </w:rPr>
-        <w:t xml:space="preserve"> 4690 ersetzt 7590 AX</w:t>
+        <w:t>- Direkt am TL-SX105: Home Assistant sowie die Uplinks nach Gast-, Wohn- und Schlafzimmer</w:t>
       </w:r>
+    </w:p>
+    <w:p>
+      <w:pPr>
+        <w:pStyle w:val="berschrift2"/>
+      </w:pPr>
       <w:r>
-        <w:rPr>
-          <w:lang w:val="de-DE"/>
-        </w:rPr>
-        <w:br/>
+        <w:t>Gastzimmer</w:t>
       </w:r>
+    </w:p>
+    <w:p>
       <w:r>
-        <w:rPr>
-          <w:lang w:val="de-DE"/>
-        </w:rPr>
-        <w:br/>
-        <w:t>Ziel:</w:t>
+        <w:t>- LAN-Dose Gast -&gt; TP-Link TL-SX1008 als Core Switch</w:t>
       </w:r>
+    </w:p>
+    <w:p>
       <w:r>
-        <w:rPr>
-          <w:lang w:val="de-DE"/>
-        </w:rPr>
-        <w:br/>
-        <w:t>- gleiche IP-Struktur (192.168.178.0/24)</w:t>
+        <w:t>- Direkt am TL-SX1008: QNAP 10G, Mac mini M2 10G, Laptop 10G, Canon PRO-1000, QNAP 2.5G und Yuanley YS25-0801</w:t>
       </w:r>
+    </w:p>
+    <w:p>
       <w:r>
-        <w:rPr>
-          <w:lang w:val="de-DE"/>
-        </w:rPr>
-        <w:br/>
-        <w:t>- gleiche DHCP-Range</w:t>
+        <w:t>- Am Yuanley-Switch: HP Pro 9022e, Fernseher und per PoE+-Adapter der U7-Pro</w:t>
       </w:r>
+    </w:p>
+    <w:p>
+      <w:pPr>
+        <w:pStyle w:val="berschrift2"/>
+      </w:pPr>
       <w:r>
-        <w:rPr>
-          <w:lang w:val="de-DE"/>
-        </w:rPr>
-        <w:br/>
-        <w:t>- gleiche WLAN-SSIDs (</w:t>
+        <w:t>Wohnzimmer</w:t>
       </w:r>
-      <w:proofErr w:type="spellStart"/>
+    </w:p>
+    <w:p>
       <w:r>
-        <w:rPr>
-          <w:lang w:val="de-DE"/>
-        </w:rPr>
-        <w:t>UniFi</w:t>
+        <w:t>- LAN-Dose Wohn -&gt; TRENDnet TPE-TG327</w:t>
       </w:r>
-      <w:proofErr w:type="spellEnd"/>
+    </w:p>
+    <w:p>
       <w:r>
-        <w:rPr>
-          <w:lang w:val="de-DE"/>
-        </w:rPr>
-        <w:t xml:space="preserve"> bleibt unverändert)</w:t>
+        <w:t>- Am TRENDnet-Switch: U7-Pro Wall, MQTT-Antenne, OpenCCU-Antenne, Fernseher und Vodafone-TV-Box</w:t>
       </w:r>
+    </w:p>
+    <w:p>
+      <w:pPr>
+        <w:pStyle w:val="berschrift2"/>
+      </w:pPr>
       <w:r>
-        <w:rPr>
-          <w:lang w:val="de-DE"/>
-        </w:rPr>
-        <w:br/>
+        <w:t>Schlafzimmer</w:t>
       </w:r>
+    </w:p>
+    <w:p>
       <w:r>
-        <w:rPr>
-          <w:lang w:val="de-DE"/>
-        </w:rPr>
-        <w:br/>
-        <w:t>Unverändert:</w:t>
+        <w:t>- LAN-Dose Schlaf -&gt; PoE+-Adapter -&gt; U7-Pro Schlafzimmer</w:t>
       </w:r>
+    </w:p>
+    <w:p>
+      <w:pPr>
+        <w:pStyle w:val="berschrift1"/>
+      </w:pPr>
       <w:r>
-        <w:rPr>
-          <w:lang w:val="de-DE"/>
-        </w:rPr>
-        <w:br/>
-        <w:t>- NAS (DNS)</w:t>
+        <w:t>5. WLAN</w:t>
       </w:r>
+    </w:p>
+    <w:p>
       <w:r>
-        <w:rPr>
-          <w:lang w:val="de-DE"/>
-        </w:rPr>
-        <w:br/>
-        <w:t xml:space="preserve">- </w:t>
+        <w:t>- Smallnet: 5 GHz / 6 GHz, WPA3</w:t>
       </w:r>
-      <w:proofErr w:type="spellStart"/>
+    </w:p>
+    <w:p>
       <w:r>
-        <w:rPr>
-          <w:lang w:val="de-DE"/>
-        </w:rPr>
-        <w:t>UniFi</w:t>
+        <w:t>- smallnet-5g: 5 GHz, WPA2/WPA3</w:t>
       </w:r>
-      <w:proofErr w:type="spellEnd"/>
+    </w:p>
+    <w:p>
       <w:r>
-        <w:rPr>
-          <w:lang w:val="de-DE"/>
-        </w:rPr>
-        <w:t xml:space="preserve"> Infrastruktur</w:t>
+        <w:t>- smallnet-iot: 2.4 GHz, WPA2, auf ausgewaehlte APs begrenzt</w:t>
       </w:r>
+    </w:p>
+    <w:p>
+      <w:pPr>
+        <w:pStyle w:val="berschrift1"/>
+      </w:pPr>
       <w:r>
-        <w:rPr>
-          <w:lang w:val="de-DE"/>
-        </w:rPr>
-        <w:br/>
-        <w:t>- Home Assistant</w:t>
+        <w:t>6. Betriebsbesonderheiten</w:t>
       </w:r>
+    </w:p>
+    <w:p>
       <w:r>
-        <w:rPr>
-          <w:lang w:val="de-DE"/>
-        </w:rPr>
-        <w:br/>
-        <w:t>- Switch-Topologie</w:t>
+        <w:t>- Das interne LAN-Subnetz wurde bei der Migration nicht geaendert.</w:t>
       </w:r>
+    </w:p>
+    <w:p>
       <w:r>
-        <w:rPr>
-          <w:lang w:val="de-DE"/>
-        </w:rPr>
-        <w:br/>
+        <w:t>- Double NAT ist aktuell bewusst aktiv.</w:t>
       </w:r>
+    </w:p>
+    <w:p>
       <w:r>
-        <w:rPr>
-          <w:lang w:val="de-DE"/>
-        </w:rPr>
-        <w:lastRenderedPageBreak/>
-        <w:br/>
-        <w:t>Migration:</w:t>
+        <w:t>- IPv6 ist aktuell bewusst deaktiviert.</w:t>
       </w:r>
+    </w:p>
+    <w:p>
       <w:r>
-        <w:rPr>
-          <w:lang w:val="de-DE"/>
-        </w:rPr>
-        <w:br/>
-        <w:t>- Austausch Gateway ohne Änderung der Layer-2 Struktur</w:t>
+        <w:t>- DNS fuer Clients zeigt weiterhin auf 192.168.178.10.</w:t>
       </w:r>
+    </w:p>
+    <w:p>
       <w:r>
-        <w:rPr>
-          <w:lang w:val="de-DE"/>
-        </w:rPr>
-        <w:br/>
+        <w:t>- Es sollen keine Produktiv-Clients direkt an der FRITZ!Box betrieben werden.</w:t>
+      </w:r>
+    </w:p>
+    <w:p>
+      <w:r>
+        <w:t>- Die Powerline-Strecke fuer Keller / Waschmaschine haengt jetzt hinter UCGF und Switch-Infrastruktur.</w:t>
+      </w:r>
+    </w:p>
+    <w:p>
+      <w:pPr>
+        <w:pStyle w:val="berschrift1"/>
+      </w:pPr>
+      <w:r>
+        <w:t>7. Migration und Zielbild</w:t>
+      </w:r>
+    </w:p>
+    <w:p>
+      <w:r>
+        <w:t>- Vor der Migration war die FRITZ!Box Gateway und DHCP-Server des Produktiv-LANs.</w:t>
+      </w:r>
+    </w:p>
+    <w:p>
+      <w:r>
+        <w:t>- Nach der Migration uebernimmt die UCGF diese Aufgaben, ohne das LAN-Subnetz oder die bekannten internen IPs zu veraendern.</w:t>
+      </w:r>
+    </w:p>
+    <w:p>
+      <w:r>
+        <w:t>- Zielbild fuer FTTH: ONT -&gt; UCGF direkt; dann entfaellt die FRITZ!Box als Upstream-Gateway.</w:t>
+      </w:r>
+    </w:p>
+    <w:p>
+      <w:pPr>
+        <w:pStyle w:val="berschrift1"/>
+      </w:pPr>
+      <w:r>
+        <w:t>8. Repository-Verweise</w:t>
+      </w:r>
+    </w:p>
+    <w:p>
+      <w:r>
+        <w:t>- Laufende Textdokumentation: _netzwerk/netzwerk_dokumentation.md</w:t>
+      </w:r>
+    </w:p>
+    <w:p>
+      <w:r>
+        <w:t>- Logisches Diagramm: _netzwerk/netzwerkdiagramm_vollstaendig.drawio</w:t>
+      </w:r>
+    </w:p>
+    <w:p>
+      <w:r>
+        <w:t>- Physische Verkabelung: _netzwerk/netzwerkdiagramm_physisch.drawio</w:t>
       </w:r>
     </w:p>
     <w:sectPr>
@@ -2164,7 +1233,7 @@
   <w:style w:type="paragraph" w:default="1" w:styleId="Standard">
     <w:name w:val="Normal"/>
     <w:qFormat/>
-    <w:rsid w:val="00FC693F"/>
+    <w:rsid w:val="0083704C"/>
   </w:style>
   <w:style w:type="paragraph" w:styleId="berschrift1">
     <w:name w:val="heading 1"/>

</xml_diff>